<commit_message>
feat: add ts to express server
</commit_message>
<xml_diff>
--- a/51IP Injenerija prykladnyh zastosunkiv/1/IP_KNT-122_Onyshchenko_19_PR1.docx
+++ b/51IP Injenerija prykladnyh zastosunkiv/1/IP_KNT-122_Onyshchenko_19_PR1.docx
@@ -2652,126 +2652,6 @@
       </w:pPr>
       <w:r>
         <w:rPr/>
-      </w:r>
-    </w:p>
-    <w:p>
-      <w:pPr>
-        <w:pStyle w:val="H2"/>
-        <w:rPr>
-          <w:b w:val="false"/>
-          <w:bCs w:val="false"/>
-          <w:i/>
-          <w:iCs/>
-        </w:rPr>
-      </w:pPr>
-      <w:r>
-        <w:rPr>
-          <w:b w:val="false"/>
-          <w:bCs w:val="false"/>
-          <w:i/>
-          <w:iCs/>
-        </w:rPr>
-        <w:t>Що означають дані в таблиці?</w:t>
-      </w:r>
-    </w:p>
-    <w:p>
-      <w:pPr>
-        <w:pStyle w:val="H2"/>
-        <w:rPr>
-          <w:b w:val="false"/>
-          <w:bCs w:val="false"/>
-          <w:i/>
-          <w:iCs/>
-        </w:rPr>
-      </w:pPr>
-      <w:r>
-        <w:rPr>
-          <w:b w:val="false"/>
-          <w:bCs w:val="false"/>
-          <w:i/>
-          <w:iCs/>
-        </w:rPr>
-        <w:t xml:space="preserve">В чому суть роботи </w:t>
-      </w:r>
-      <w:r>
-        <w:rPr>
-          <w:b w:val="false"/>
-          <w:bCs w:val="false"/>
-          <w:i/>
-          <w:iCs/>
-          <w:lang w:val="en-US"/>
-        </w:rPr>
-        <w:t xml:space="preserve">ARIMA (SARIMAX, </w:t>
-      </w:r>
-      <w:r>
-        <w:rPr>
-          <w:b w:val="false"/>
-          <w:bCs w:val="false"/>
-          <w:i/>
-          <w:iCs/>
-          <w:lang w:val="uk-UA"/>
-        </w:rPr>
-        <w:t>як в програмі</w:t>
-      </w:r>
-      <w:r>
-        <w:rPr>
-          <w:b w:val="false"/>
-          <w:bCs w:val="false"/>
-          <w:i/>
-          <w:iCs/>
-          <w:lang w:val="en-US"/>
-        </w:rPr>
-        <w:t>)?</w:t>
-      </w:r>
-    </w:p>
-    <w:p>
-      <w:pPr>
-        <w:pStyle w:val="H2"/>
-        <w:rPr>
-          <w:b w:val="false"/>
-          <w:bCs w:val="false"/>
-          <w:i/>
-          <w:iCs/>
-        </w:rPr>
-      </w:pPr>
-      <w:r>
-        <w:rPr>
-          <w:b w:val="false"/>
-          <w:bCs w:val="false"/>
-          <w:i/>
-          <w:iCs/>
-        </w:rPr>
-        <w:t xml:space="preserve">В чому суть роботи </w:t>
-      </w:r>
-      <w:r>
-        <w:rPr>
-          <w:b w:val="false"/>
-          <w:bCs w:val="false"/>
-          <w:i/>
-          <w:iCs/>
-          <w:lang w:val="en-US"/>
-        </w:rPr>
-        <w:t>ETS?</w:t>
-      </w:r>
-    </w:p>
-    <w:p>
-      <w:pPr>
-        <w:pStyle w:val="H2"/>
-        <w:rPr>
-          <w:b w:val="false"/>
-          <w:bCs w:val="false"/>
-          <w:i/>
-          <w:iCs/>
-        </w:rPr>
-      </w:pPr>
-      <w:r>
-        <w:rPr>
-          <w:b w:val="false"/>
-          <w:bCs w:val="false"/>
-          <w:i/>
-          <w:iCs/>
-        </w:rPr>
-        <w:t>Чим вони відрізняються?</w:t>
       </w:r>
     </w:p>
     <w:p>

</xml_diff>